<commit_message>
Update menu flyer with new dishes and prices
Co-Authored-By: Claude Opus 5.5 <noreply@anthropic.com>
Claude-Session: https://claude.ai/code/session_01WQg3TD9BK9rRRVRT1LJhsu
</commit_message>
<xml_diff>
--- a/marketing/Ghar-Masala-menu-flyer-EDITABLE.docx
+++ b/marketing/Ghar-Masala-menu-flyer-EDITABLE.docx
@@ -1377,6 +1377,15 @@
             <w:r>
               <w:rPr>
                 <w:rFonts w:ascii="Arial" w:cs="Arial" w:eastAsia="Arial" w:hAnsi="Arial"/>
+                <w:color w:val="D0461B"/>
+                <w:sz w:val="14"/>
+                <w:szCs w:val="14"/>
+              </w:rPr>
+              <w:t xml:space="preserve"> ●</w:t>
+            </w:r>
+            <w:r>
+              <w:rPr>
+                <w:rFonts w:ascii="Arial" w:cs="Arial" w:eastAsia="Arial" w:hAnsi="Arial"/>
                 <w:b/>
                 <w:bCs/>
                 <w:color w:val="EDA01E"/>
@@ -1394,7 +1403,7 @@
                 <w:sz w:val="19"/>
                 <w:szCs w:val="19"/>
               </w:rPr>
-              <w:t xml:space="preserve">	£3.95</w:t>
+              <w:t xml:space="preserve">	£4.45</w:t>
             </w:r>
           </w:p>
           <w:p>
@@ -1556,7 +1565,7 @@
                 <w:sz w:val="19"/>
                 <w:szCs w:val="19"/>
               </w:rPr>
-              <w:t xml:space="preserve">Chicken Curry (boneless)</w:t>
+              <w:t xml:space="preserve">Chicken Curry</w:t>
             </w:r>
             <w:r>
               <w:rPr>
@@ -1565,7 +1574,7 @@
                 <w:sz w:val="14"/>
                 <w:szCs w:val="14"/>
               </w:rPr>
-              <w:t xml:space="preserve"> ●●</w:t>
+              <w:t xml:space="preserve"> ●</w:t>
             </w:r>
             <w:r>
               <w:rPr>
@@ -1583,11 +1592,22 @@
                 <w:rFonts w:ascii="Arial" w:cs="Arial" w:eastAsia="Arial" w:hAnsi="Arial"/>
                 <w:b/>
                 <w:bCs/>
-                <w:color w:val="16211C"/>
-                <w:sz w:val="19"/>
-                <w:szCs w:val="19"/>
-              </w:rPr>
-              <w:t xml:space="preserve">	£7.95</w:t>
+                <w:color w:val="B33A14"/>
+                <w:sz w:val="12"/>
+                <w:szCs w:val="12"/>
+              </w:rPr>
+              <w:t xml:space="preserve"> SPICE TO ORDER</w:t>
+            </w:r>
+            <w:r>
+              <w:rPr>
+                <w:rFonts w:ascii="Arial" w:cs="Arial" w:eastAsia="Arial" w:hAnsi="Arial"/>
+                <w:b/>
+                <w:bCs/>
+                <w:color w:val="16211C"/>
+                <w:sz w:val="19"/>
+                <w:szCs w:val="19"/>
+              </w:rPr>
+              <w:t xml:space="preserve">	£8.25</w:t>
             </w:r>
           </w:p>
           <w:p>
@@ -1601,7 +1621,7 @@
                 <w:sz w:val="15"/>
                 <w:szCs w:val="15"/>
               </w:rPr>
-              <w:t xml:space="preserve">Tender chicken breast pieces, slow-cooked in a rich, home style curry sauce, balanced with traditional spices for comforting flavour.</w:t>
+              <w:t xml:space="preserve">Tender, boneless, chicken breast pieces, slow-cooked in a rich, home style curry sauce, balanced with traditional spices for comforting flavour.</w:t>
             </w:r>
           </w:p>
           <w:p>
@@ -1621,7 +1641,16 @@
                 <w:sz w:val="19"/>
                 <w:szCs w:val="19"/>
               </w:rPr>
-              <w:t xml:space="preserve">Chicken Biryani</w:t>
+              <w:t xml:space="preserve">Lamb Curry</w:t>
+            </w:r>
+            <w:r>
+              <w:rPr>
+                <w:rFonts w:ascii="Arial" w:cs="Arial" w:eastAsia="Arial" w:hAnsi="Arial"/>
+                <w:color w:val="D0461B"/>
+                <w:sz w:val="14"/>
+                <w:szCs w:val="14"/>
+              </w:rPr>
+              <w:t xml:space="preserve"> ●</w:t>
             </w:r>
             <w:r>
               <w:rPr>
@@ -1639,11 +1668,22 @@
                 <w:rFonts w:ascii="Arial" w:cs="Arial" w:eastAsia="Arial" w:hAnsi="Arial"/>
                 <w:b/>
                 <w:bCs/>
-                <w:color w:val="16211C"/>
-                <w:sz w:val="19"/>
-                <w:szCs w:val="19"/>
-              </w:rPr>
-              <w:t xml:space="preserve">	£8.50</w:t>
+                <w:color w:val="B33A14"/>
+                <w:sz w:val="12"/>
+                <w:szCs w:val="12"/>
+              </w:rPr>
+              <w:t xml:space="preserve"> SPICE TO ORDER</w:t>
+            </w:r>
+            <w:r>
+              <w:rPr>
+                <w:rFonts w:ascii="Arial" w:cs="Arial" w:eastAsia="Arial" w:hAnsi="Arial"/>
+                <w:b/>
+                <w:bCs/>
+                <w:color w:val="16211C"/>
+                <w:sz w:val="19"/>
+                <w:szCs w:val="19"/>
+              </w:rPr>
+              <w:t xml:space="preserve">	£9.45</w:t>
             </w:r>
           </w:p>
           <w:p>
@@ -1657,7 +1697,7 @@
                 <w:sz w:val="15"/>
                 <w:szCs w:val="15"/>
               </w:rPr>
-              <w:t xml:space="preserve">Fragrant basmati layered with spiced chicken &amp; fried onions.</w:t>
+              <w:t xml:space="preserve">Succulent boneless lamb, gently cooked until tender in a hearty, spiced curry sauce full of warmth and depth.</w:t>
             </w:r>
           </w:p>
           <w:p>
@@ -1677,7 +1717,7 @@
                 <w:sz w:val="19"/>
                 <w:szCs w:val="19"/>
               </w:rPr>
-              <w:t xml:space="preserve">Lamb Curry</w:t>
+              <w:t xml:space="preserve">King Prawn Curry</w:t>
             </w:r>
             <w:r>
               <w:rPr>
@@ -1686,7 +1726,7 @@
                 <w:sz w:val="14"/>
                 <w:szCs w:val="14"/>
               </w:rPr>
-              <w:t xml:space="preserve"> ●●●</w:t>
+              <w:t xml:space="preserve"> ●</w:t>
             </w:r>
             <w:r>
               <w:rPr>
@@ -1704,11 +1744,22 @@
                 <w:rFonts w:ascii="Arial" w:cs="Arial" w:eastAsia="Arial" w:hAnsi="Arial"/>
                 <w:b/>
                 <w:bCs/>
-                <w:color w:val="16211C"/>
-                <w:sz w:val="19"/>
-                <w:szCs w:val="19"/>
-              </w:rPr>
-              <w:t xml:space="preserve">	£9.25</w:t>
+                <w:color w:val="B33A14"/>
+                <w:sz w:val="12"/>
+                <w:szCs w:val="12"/>
+              </w:rPr>
+              <w:t xml:space="preserve"> SPICE TO ORDER</w:t>
+            </w:r>
+            <w:r>
+              <w:rPr>
+                <w:rFonts w:ascii="Arial" w:cs="Arial" w:eastAsia="Arial" w:hAnsi="Arial"/>
+                <w:b/>
+                <w:bCs/>
+                <w:color w:val="16211C"/>
+                <w:sz w:val="19"/>
+                <w:szCs w:val="19"/>
+              </w:rPr>
+              <w:t xml:space="preserve">	£9.95</w:t>
             </w:r>
           </w:p>
           <w:p>
@@ -1722,7 +1773,7 @@
                 <w:sz w:val="15"/>
                 <w:szCs w:val="15"/>
               </w:rPr>
-              <w:t xml:space="preserve">Lamb on the bone, slow-cooked for hours in our house curry sauce.</w:t>
+              <w:t xml:space="preserve">Juicy king prawns cooked in a fragrant, lightly spiced curry sauce — comforting, rich and perfectly balanced.</w:t>
             </w:r>
           </w:p>
           <w:p>
@@ -1742,7 +1793,7 @@
                 <w:sz w:val="19"/>
                 <w:szCs w:val="19"/>
               </w:rPr>
-              <w:t xml:space="preserve">King Prawn Curry</w:t>
+              <w:t xml:space="preserve">Tarka Dhal</w:t>
             </w:r>
             <w:r>
               <w:rPr>
@@ -1760,11 +1811,22 @@
                 <w:rFonts w:ascii="Arial" w:cs="Arial" w:eastAsia="Arial" w:hAnsi="Arial"/>
                 <w:b/>
                 <w:bCs/>
-                <w:color w:val="16211C"/>
-                <w:sz w:val="19"/>
-                <w:szCs w:val="19"/>
-              </w:rPr>
-              <w:t xml:space="preserve">	£9.45</w:t>
+                <w:color w:val="006A4E"/>
+                <w:sz w:val="16"/>
+                <w:szCs w:val="16"/>
+              </w:rPr>
+              <w:t xml:space="preserve"> (V)</w:t>
+            </w:r>
+            <w:r>
+              <w:rPr>
+                <w:rFonts w:ascii="Arial" w:cs="Arial" w:eastAsia="Arial" w:hAnsi="Arial"/>
+                <w:b/>
+                <w:bCs/>
+                <w:color w:val="16211C"/>
+                <w:sz w:val="19"/>
+                <w:szCs w:val="19"/>
+              </w:rPr>
+              <w:t xml:space="preserve">	£6.95</w:t>
             </w:r>
           </w:p>
           <w:p>
@@ -1778,74 +1840,7 @@
                 <w:sz w:val="15"/>
                 <w:szCs w:val="15"/>
               </w:rPr>
-              <w:t xml:space="preserve">Juicy king prawns cooked in a fragrant, lightly spiced curry sauce — comforting, rich and perfectly balanced.</w:t>
-            </w:r>
-          </w:p>
-          <w:p>
-            <w:pPr>
-              <w:keepNext/>
-              <w:tabs>
-                <w:tab w:val="right" w:pos="4966" w:leader="dot"/>
-              </w:tabs>
-              <w:spacing w:after="0" w:before="40"/>
-            </w:pPr>
-            <w:r>
-              <w:rPr>
-                <w:rFonts w:ascii="Arial" w:cs="Arial" w:eastAsia="Arial" w:hAnsi="Arial"/>
-                <w:b/>
-                <w:bCs/>
-                <w:color w:val="16211C"/>
-                <w:sz w:val="19"/>
-                <w:szCs w:val="19"/>
-              </w:rPr>
-              <w:t xml:space="preserve">Tarka Dhal</w:t>
-            </w:r>
-            <w:r>
-              <w:rPr>
-                <w:rFonts w:ascii="Arial" w:cs="Arial" w:eastAsia="Arial" w:hAnsi="Arial"/>
-                <w:b/>
-                <w:bCs/>
-                <w:color w:val="EDA01E"/>
-                <w:sz w:val="18"/>
-                <w:szCs w:val="18"/>
-              </w:rPr>
-              <w:t xml:space="preserve"> ★</w:t>
-            </w:r>
-            <w:r>
-              <w:rPr>
-                <w:rFonts w:ascii="Arial" w:cs="Arial" w:eastAsia="Arial" w:hAnsi="Arial"/>
-                <w:b/>
-                <w:bCs/>
-                <w:color w:val="006A4E"/>
-                <w:sz w:val="16"/>
-                <w:szCs w:val="16"/>
-              </w:rPr>
-              <w:t xml:space="preserve"> (V)</w:t>
-            </w:r>
-            <w:r>
-              <w:rPr>
-                <w:rFonts w:ascii="Arial" w:cs="Arial" w:eastAsia="Arial" w:hAnsi="Arial"/>
-                <w:b/>
-                <w:bCs/>
-                <w:color w:val="16211C"/>
-                <w:sz w:val="19"/>
-                <w:szCs w:val="19"/>
-              </w:rPr>
-              <w:t xml:space="preserve">	£6.45</w:t>
-            </w:r>
-          </w:p>
-          <w:p>
-            <w:pPr>
-              <w:spacing w:after="50" w:before="0"/>
-            </w:pPr>
-            <w:r>
-              <w:rPr>
-                <w:rFonts w:ascii="Arial" w:cs="Arial" w:eastAsia="Arial" w:hAnsi="Arial"/>
-                <w:color w:val="5B655F"/>
-                <w:sz w:val="15"/>
-                <w:szCs w:val="15"/>
-              </w:rPr>
-              <w:t xml:space="preserve">A lentil curry slow-cooked until soft and creamy, finished with a fragrant tarka of garlic, onions, dry chillies and warming spices.</w:t>
+              <w:t xml:space="preserve">A lentil curry slow-cooked until soft and creamy, finished with a fragrant tarka of garlic, onions and warming spices.</w:t>
             </w:r>
           </w:p>
           <w:p>
@@ -2121,7 +2116,7 @@
                 <w:sz w:val="19"/>
                 <w:szCs w:val="19"/>
               </w:rPr>
-              <w:t xml:space="preserve">	£3.45</w:t>
+              <w:t xml:space="preserve">	£3.75</w:t>
             </w:r>
           </w:p>
           <w:p>
@@ -2233,7 +2228,7 @@
                 <w:sz w:val="19"/>
                 <w:szCs w:val="19"/>
               </w:rPr>
-              <w:t xml:space="preserve">	£2.95</w:t>
+              <w:t xml:space="preserve">	£3.25</w:t>
             </w:r>
           </w:p>
           <w:p>
@@ -2276,7 +2271,7 @@
                 <w:sz w:val="14"/>
                 <w:szCs w:val="14"/>
               </w:rPr>
-              <w:t xml:space="preserve"> ●</w:t>
+              <w:t xml:space="preserve"> ●●</w:t>
             </w:r>
             <w:r>
               <w:rPr>
@@ -2348,6 +2343,15 @@
             <w:r>
               <w:rPr>
                 <w:rFonts w:ascii="Arial" w:cs="Arial" w:eastAsia="Arial" w:hAnsi="Arial"/>
+                <w:color w:val="D0461B"/>
+                <w:sz w:val="14"/>
+                <w:szCs w:val="14"/>
+              </w:rPr>
+              <w:t xml:space="preserve"> ●</w:t>
+            </w:r>
+            <w:r>
+              <w:rPr>
+                <w:rFonts w:ascii="Arial" w:cs="Arial" w:eastAsia="Arial" w:hAnsi="Arial"/>
                 <w:b/>
                 <w:bCs/>
                 <w:color w:val="EDA01E"/>
@@ -2584,100 +2588,6 @@
                 <w:sz w:val="24"/>
                 <w:szCs w:val="24"/>
               </w:rPr>
-              <w:t xml:space="preserve">DESSERTS</w:t>
-            </w:r>
-          </w:p>
-          <w:p>
-            <w:pPr>
-              <w:keepNext/>
-              <w:spacing w:after="20" w:before="0"/>
-            </w:pPr>
-            <w:r>
-              <w:rPr>
-                <w:rFonts w:ascii="Arial" w:cs="Arial" w:eastAsia="Arial" w:hAnsi="Arial"/>
-                <w:i/>
-                <w:iCs/>
-                <w:color w:val="5B655F"/>
-                <w:sz w:val="15"/>
-                <w:szCs w:val="15"/>
-              </w:rPr>
-              <w:t xml:space="preserve">Made fresh on the day</w:t>
-            </w:r>
-          </w:p>
-          <w:p>
-            <w:pPr>
-              <w:keepNext/>
-              <w:tabs>
-                <w:tab w:val="right" w:pos="4966" w:leader="dot"/>
-              </w:tabs>
-              <w:spacing w:after="0" w:before="40"/>
-            </w:pPr>
-            <w:r>
-              <w:rPr>
-                <w:rFonts w:ascii="Arial" w:cs="Arial" w:eastAsia="Arial" w:hAnsi="Arial"/>
-                <w:b/>
-                <w:bCs/>
-                <w:color w:val="16211C"/>
-                <w:sz w:val="19"/>
-                <w:szCs w:val="19"/>
-              </w:rPr>
-              <w:t xml:space="preserve">Gulab Jamun</w:t>
-            </w:r>
-            <w:r>
-              <w:rPr>
-                <w:rFonts w:ascii="Arial" w:cs="Arial" w:eastAsia="Arial" w:hAnsi="Arial"/>
-                <w:b/>
-                <w:bCs/>
-                <w:color w:val="006A4E"/>
-                <w:sz w:val="16"/>
-                <w:szCs w:val="16"/>
-              </w:rPr>
-              <w:t xml:space="preserve"> (V)</w:t>
-            </w:r>
-            <w:r>
-              <w:rPr>
-                <w:rFonts w:ascii="Arial" w:cs="Arial" w:eastAsia="Arial" w:hAnsi="Arial"/>
-                <w:b/>
-                <w:bCs/>
-                <w:color w:val="16211C"/>
-                <w:sz w:val="19"/>
-                <w:szCs w:val="19"/>
-              </w:rPr>
-              <w:t xml:space="preserve">	£3.50</w:t>
-            </w:r>
-          </w:p>
-          <w:p>
-            <w:pPr>
-              <w:spacing w:after="50" w:before="0"/>
-            </w:pPr>
-            <w:r>
-              <w:rPr>
-                <w:rFonts w:ascii="Arial" w:cs="Arial" w:eastAsia="Arial" w:hAnsi="Arial"/>
-                <w:color w:val="5B655F"/>
-                <w:sz w:val="15"/>
-                <w:szCs w:val="15"/>
-              </w:rPr>
-              <w:t xml:space="preserve">Warm milk dumplings in cardamom syrup.</w:t>
-            </w:r>
-          </w:p>
-          <w:p>
-            <w:pPr>
-              <w:keepNext/>
-              <w:pBdr>
-                <w:bottom w:val="single" w:color="EDA01E" w:sz="8" w:space="2"/>
-              </w:pBdr>
-              <w:spacing w:after="30" w:before="120"/>
-            </w:pPr>
-            <w:r>
-              <w:rPr>
-                <w:rFonts w:ascii="Arial" w:cs="Arial" w:eastAsia="Arial" w:hAnsi="Arial"/>
-                <w:b/>
-                <w:bCs/>
-                <w:color w:val="006A4E"/>
-                <w:spacing w:val="20"/>
-                <w:sz w:val="24"/>
-                <w:szCs w:val="24"/>
-              </w:rPr>
               <w:t xml:space="preserve">DRINKS</w:t>
             </w:r>
           </w:p>
@@ -2698,18 +2608,18 @@
                 <w:sz w:val="19"/>
                 <w:szCs w:val="19"/>
               </w:rPr>
-              <w:t xml:space="preserve">Mango Lassi</w:t>
-            </w:r>
-            <w:r>
-              <w:rPr>
-                <w:rFonts w:ascii="Arial" w:cs="Arial" w:eastAsia="Arial" w:hAnsi="Arial"/>
-                <w:b/>
-                <w:bCs/>
-                <w:color w:val="16211C"/>
-                <w:sz w:val="19"/>
-                <w:szCs w:val="19"/>
-              </w:rPr>
-              <w:t xml:space="preserve">	£2.95</w:t>
+              <w:t xml:space="preserve">Coke (can)</w:t>
+            </w:r>
+            <w:r>
+              <w:rPr>
+                <w:rFonts w:ascii="Arial" w:cs="Arial" w:eastAsia="Arial" w:hAnsi="Arial"/>
+                <w:b/>
+                <w:bCs/>
+                <w:color w:val="16211C"/>
+                <w:sz w:val="19"/>
+                <w:szCs w:val="19"/>
+              </w:rPr>
+              <w:t xml:space="preserve">	£1.45</w:t>
             </w:r>
           </w:p>
           <w:p>
@@ -2736,17 +2646,6 @@
                 <w:rFonts w:ascii="Arial" w:cs="Arial" w:eastAsia="Arial" w:hAnsi="Arial"/>
                 <w:b/>
                 <w:bCs/>
-                <w:color w:val="006A4E"/>
-                <w:sz w:val="16"/>
-                <w:szCs w:val="16"/>
-              </w:rPr>
-              <w:t xml:space="preserve"> (V)</w:t>
-            </w:r>
-            <w:r>
-              <w:rPr>
-                <w:rFonts w:ascii="Arial" w:cs="Arial" w:eastAsia="Arial" w:hAnsi="Arial"/>
-                <w:b/>
-                <w:bCs/>
                 <w:color w:val="16211C"/>
                 <w:sz w:val="19"/>
                 <w:szCs w:val="19"/>
@@ -2778,17 +2677,6 @@
                 <w:rFonts w:ascii="Arial" w:cs="Arial" w:eastAsia="Arial" w:hAnsi="Arial"/>
                 <w:b/>
                 <w:bCs/>
-                <w:color w:val="006A4E"/>
-                <w:sz w:val="16"/>
-                <w:szCs w:val="16"/>
-              </w:rPr>
-              <w:t xml:space="preserve"> (V)</w:t>
-            </w:r>
-            <w:r>
-              <w:rPr>
-                <w:rFonts w:ascii="Arial" w:cs="Arial" w:eastAsia="Arial" w:hAnsi="Arial"/>
-                <w:b/>
-                <w:bCs/>
                 <w:color w:val="16211C"/>
                 <w:sz w:val="19"/>
                 <w:szCs w:val="19"/>
@@ -2820,17 +2708,6 @@
                 <w:rFonts w:ascii="Arial" w:cs="Arial" w:eastAsia="Arial" w:hAnsi="Arial"/>
                 <w:b/>
                 <w:bCs/>
-                <w:color w:val="006A4E"/>
-                <w:sz w:val="16"/>
-                <w:szCs w:val="16"/>
-              </w:rPr>
-              <w:t xml:space="preserve"> (V)</w:t>
-            </w:r>
-            <w:r>
-              <w:rPr>
-                <w:rFonts w:ascii="Arial" w:cs="Arial" w:eastAsia="Arial" w:hAnsi="Arial"/>
-                <w:b/>
-                <w:bCs/>
                 <w:color w:val="16211C"/>
                 <w:sz w:val="19"/>
                 <w:szCs w:val="19"/>
@@ -2862,17 +2739,6 @@
                 <w:rFonts w:ascii="Arial" w:cs="Arial" w:eastAsia="Arial" w:hAnsi="Arial"/>
                 <w:b/>
                 <w:bCs/>
-                <w:color w:val="006A4E"/>
-                <w:sz w:val="16"/>
-                <w:szCs w:val="16"/>
-              </w:rPr>
-              <w:t xml:space="preserve"> (V)</w:t>
-            </w:r>
-            <w:r>
-              <w:rPr>
-                <w:rFonts w:ascii="Arial" w:cs="Arial" w:eastAsia="Arial" w:hAnsi="Arial"/>
-                <w:b/>
-                <w:bCs/>
                 <w:color w:val="16211C"/>
                 <w:sz w:val="19"/>
                 <w:szCs w:val="19"/>
@@ -2898,17 +2764,6 @@
                 <w:szCs w:val="19"/>
               </w:rPr>
               <w:t xml:space="preserve">Water (bottle)</w:t>
-            </w:r>
-            <w:r>
-              <w:rPr>
-                <w:rFonts w:ascii="Arial" w:cs="Arial" w:eastAsia="Arial" w:hAnsi="Arial"/>
-                <w:b/>
-                <w:bCs/>
-                <w:color w:val="006A4E"/>
-                <w:sz w:val="16"/>
-                <w:szCs w:val="16"/>
-              </w:rPr>
-              <w:t xml:space="preserve"> (V)</w:t>
             </w:r>
             <w:r>
               <w:rPr>

</xml_diff>

<commit_message>
Flyer: add 25% off first order for new customers
Co-Authored-By: Claude Opus 5.5 <noreply@anthropic.com>
Claude-Session: https://claude.ai/code/session_01WQg3TD9BK9rRRVRT1LJhsu
</commit_message>
<xml_diff>
--- a/marketing/Ghar-Masala-menu-flyer-EDITABLE.docx
+++ b/marketing/Ghar-Masala-menu-flyer-EDITABLE.docx
@@ -120,7 +120,7 @@
           </w:p>
           <w:p>
             <w:pPr>
-              <w:spacing w:after="60" w:before="0"/>
+              <w:spacing w:after="120" w:before="0"/>
               <w:jc w:val="right"/>
             </w:pPr>
             <w:r>
@@ -134,6 +134,50 @@
                 <w:szCs w:val="16"/>
               </w:rPr>
               <w:t xml:space="preserve">TIVIDALE · OLDBURY · FRESH TO ORDER</w:t>
+            </w:r>
+          </w:p>
+          <w:p>
+            <w:pPr>
+              <w:spacing w:after="0" w:before="0"/>
+              <w:jc w:val="right"/>
+            </w:pPr>
+            <w:r>
+              <w:rPr>
+                <w:rFonts w:ascii="Arial" w:cs="Arial" w:eastAsia="Arial" w:hAnsi="Arial"/>
+                <w:b/>
+                <w:bCs/>
+                <w:color w:val="F7F5F1"/>
+                <w:spacing w:val="20"/>
+                <w:sz w:val="16"/>
+                <w:szCs w:val="16"/>
+              </w:rPr>
+              <w:t xml:space="preserve">NEW CUSTOMERS  </w:t>
+            </w:r>
+            <w:r>
+              <w:rPr>
+                <w:rFonts w:ascii="Arial" w:cs="Arial" w:eastAsia="Arial" w:hAnsi="Arial"/>
+                <w:b/>
+                <w:bCs/>
+                <w:color w:val="EDA01E"/>
+                <w:sz w:val="34"/>
+                <w:szCs w:val="34"/>
+              </w:rPr>
+              <w:t xml:space="preserve">25% OFF</w:t>
+            </w:r>
+          </w:p>
+          <w:p>
+            <w:pPr>
+              <w:spacing w:after="0" w:before="0"/>
+              <w:jc w:val="right"/>
+            </w:pPr>
+            <w:r>
+              <w:rPr>
+                <w:rFonts w:ascii="Arial" w:cs="Arial" w:eastAsia="Arial" w:hAnsi="Arial"/>
+                <w:color w:val="F7F5F1"/>
+                <w:sz w:val="16"/>
+                <w:szCs w:val="16"/>
+              </w:rPr>
+              <w:t xml:space="preserve">your first order online</w:t>
             </w:r>
           </w:p>
         </w:tc>
@@ -3022,6 +3066,22 @@
                 <w:szCs w:val="26"/>
               </w:rPr>
               <w:t xml:space="preserve">Order online at ghar-masala.co.uk</w:t>
+            </w:r>
+          </w:p>
+          <w:p>
+            <w:pPr>
+              <w:spacing w:after="20" w:before="0"/>
+            </w:pPr>
+            <w:r>
+              <w:rPr>
+                <w:rFonts w:ascii="Arial" w:cs="Arial" w:eastAsia="Arial" w:hAnsi="Arial"/>
+                <w:b/>
+                <w:bCs/>
+                <w:color w:val="F2AF3E"/>
+                <w:sz w:val="16"/>
+                <w:szCs w:val="16"/>
+              </w:rPr>
+              <w:t xml:space="preserve">New customers: 25% off your first order online.</w:t>
             </w:r>
           </w:p>
           <w:p>

</xml_diff>

<commit_message>
Flyer: add Popadums, swap Curries and Sundries
Co-Authored-By: Claude Opus 5.5 <noreply@anthropic.com>
Claude-Session: https://claude.ai/code/session_01WQg3TD9BK9rRRVRT1LJhsu
</commit_message>
<xml_diff>
--- a/marketing/Ghar-Masala-menu-flyer-EDITABLE.docx
+++ b/marketing/Ghar-Masala-menu-flyer-EDITABLE.docx
@@ -1315,7 +1315,7 @@
                 <w:sz w:val="19"/>
                 <w:szCs w:val="19"/>
               </w:rPr>
-              <w:t xml:space="preserve">Vegetable Samosas</w:t>
+              <w:t xml:space="preserve">Popadums</w:t>
             </w:r>
             <w:r>
               <w:rPr>
@@ -1337,7 +1337,7 @@
                 <w:sz w:val="19"/>
                 <w:szCs w:val="19"/>
               </w:rPr>
-              <w:t xml:space="preserve">	£3.95</w:t>
+              <w:t xml:space="preserve">	£0.95</w:t>
             </w:r>
           </w:p>
           <w:p>
@@ -1351,7 +1351,7 @@
                 <w:sz w:val="15"/>
                 <w:szCs w:val="15"/>
               </w:rPr>
-              <w:t xml:space="preserve">Golden, crisp pastries generously filled with gently spiced vegetables, fried until perfectly flaky and satisfying.</w:t>
+              <w:t xml:space="preserve">Crispy, light and deliciously crunchy poppadoms, perfect for enjoying alongside your favourite curry or as a tasty starter.</w:t>
             </w:r>
           </w:p>
           <w:p>
@@ -1371,7 +1371,18 @@
                 <w:sz w:val="19"/>
                 <w:szCs w:val="19"/>
               </w:rPr>
-              <w:t xml:space="preserve">Lamb Samosas</w:t>
+              <w:t xml:space="preserve">Vegetable Samosas</w:t>
+            </w:r>
+            <w:r>
+              <w:rPr>
+                <w:rFonts w:ascii="Arial" w:cs="Arial" w:eastAsia="Arial" w:hAnsi="Arial"/>
+                <w:b/>
+                <w:bCs/>
+                <w:color w:val="006A4E"/>
+                <w:sz w:val="16"/>
+                <w:szCs w:val="16"/>
+              </w:rPr>
+              <w:t xml:space="preserve"> (V)</w:t>
             </w:r>
             <w:r>
               <w:rPr>
@@ -1396,7 +1407,7 @@
                 <w:sz w:val="15"/>
                 <w:szCs w:val="15"/>
               </w:rPr>
-              <w:t xml:space="preserve">Crispy pastry parcels filled with seasoned minced lamb, rich in flavour and comforting in every bite.</w:t>
+              <w:t xml:space="preserve">Golden, crisp pastries generously filled with gently spiced vegetables, fried until perfectly flaky and satisfying.</w:t>
             </w:r>
           </w:p>
           <w:p>
@@ -1416,38 +1427,18 @@
                 <w:sz w:val="19"/>
                 <w:szCs w:val="19"/>
               </w:rPr>
-              <w:t xml:space="preserve">Chicken Tikka Spring-Rolls</w:t>
-            </w:r>
-            <w:r>
-              <w:rPr>
-                <w:rFonts w:ascii="Arial" w:cs="Arial" w:eastAsia="Arial" w:hAnsi="Arial"/>
-                <w:color w:val="D0461B"/>
-                <w:sz w:val="14"/>
-                <w:szCs w:val="14"/>
-              </w:rPr>
-              <w:t xml:space="preserve"> ●</w:t>
-            </w:r>
-            <w:r>
-              <w:rPr>
-                <w:rFonts w:ascii="Arial" w:cs="Arial" w:eastAsia="Arial" w:hAnsi="Arial"/>
-                <w:b/>
-                <w:bCs/>
-                <w:color w:val="EDA01E"/>
-                <w:sz w:val="18"/>
-                <w:szCs w:val="18"/>
-              </w:rPr>
-              <w:t xml:space="preserve"> ★</w:t>
-            </w:r>
-            <w:r>
-              <w:rPr>
-                <w:rFonts w:ascii="Arial" w:cs="Arial" w:eastAsia="Arial" w:hAnsi="Arial"/>
-                <w:b/>
-                <w:bCs/>
-                <w:color w:val="16211C"/>
-                <w:sz w:val="19"/>
-                <w:szCs w:val="19"/>
-              </w:rPr>
-              <w:t xml:space="preserve">	£4.45</w:t>
+              <w:t xml:space="preserve">Lamb Samosas</w:t>
+            </w:r>
+            <w:r>
+              <w:rPr>
+                <w:rFonts w:ascii="Arial" w:cs="Arial" w:eastAsia="Arial" w:hAnsi="Arial"/>
+                <w:b/>
+                <w:bCs/>
+                <w:color w:val="16211C"/>
+                <w:sz w:val="19"/>
+                <w:szCs w:val="19"/>
+              </w:rPr>
+              <w:t xml:space="preserve">	£3.95</w:t>
             </w:r>
           </w:p>
           <w:p>
@@ -1461,7 +1452,7 @@
                 <w:sz w:val="15"/>
                 <w:szCs w:val="15"/>
               </w:rPr>
-              <w:t xml:space="preserve">Crisp golden rolls filled with our spiced chicken tikka, fried until flaky and satisfying.</w:t>
+              <w:t xml:space="preserve">Crispy pastry parcels filled with seasoned minced lamb, rich in flavour and comforting in every bite.</w:t>
             </w:r>
           </w:p>
           <w:p>
@@ -1481,18 +1472,38 @@
                 <w:sz w:val="19"/>
                 <w:szCs w:val="19"/>
               </w:rPr>
-              <w:t xml:space="preserve">Chicken Tikka</w:t>
-            </w:r>
-            <w:r>
-              <w:rPr>
-                <w:rFonts w:ascii="Arial" w:cs="Arial" w:eastAsia="Arial" w:hAnsi="Arial"/>
-                <w:b/>
-                <w:bCs/>
-                <w:color w:val="16211C"/>
-                <w:sz w:val="19"/>
-                <w:szCs w:val="19"/>
-              </w:rPr>
-              <w:t xml:space="preserve">	£4.95</w:t>
+              <w:t xml:space="preserve">Chicken Tikka Spring-Rolls</w:t>
+            </w:r>
+            <w:r>
+              <w:rPr>
+                <w:rFonts w:ascii="Arial" w:cs="Arial" w:eastAsia="Arial" w:hAnsi="Arial"/>
+                <w:color w:val="D0461B"/>
+                <w:sz w:val="14"/>
+                <w:szCs w:val="14"/>
+              </w:rPr>
+              <w:t xml:space="preserve"> ●</w:t>
+            </w:r>
+            <w:r>
+              <w:rPr>
+                <w:rFonts w:ascii="Arial" w:cs="Arial" w:eastAsia="Arial" w:hAnsi="Arial"/>
+                <w:b/>
+                <w:bCs/>
+                <w:color w:val="EDA01E"/>
+                <w:sz w:val="18"/>
+                <w:szCs w:val="18"/>
+              </w:rPr>
+              <w:t xml:space="preserve"> ★</w:t>
+            </w:r>
+            <w:r>
+              <w:rPr>
+                <w:rFonts w:ascii="Arial" w:cs="Arial" w:eastAsia="Arial" w:hAnsi="Arial"/>
+                <w:b/>
+                <w:bCs/>
+                <w:color w:val="16211C"/>
+                <w:sz w:val="19"/>
+                <w:szCs w:val="19"/>
+              </w:rPr>
+              <w:t xml:space="preserve">	£4.45</w:t>
             </w:r>
           </w:p>
           <w:p>
@@ -1506,7 +1517,7 @@
                 <w:sz w:val="15"/>
                 <w:szCs w:val="15"/>
               </w:rPr>
-              <w:t xml:space="preserve">Tender chicken pieces marinated in our flavourful homemade tikka spices, gently cooked with fried onions for extra depth.</w:t>
+              <w:t xml:space="preserve">Crisp golden rolls filled with our spiced chicken tikka, fried until flaky and satisfying.</w:t>
             </w:r>
           </w:p>
           <w:p>
@@ -1526,6 +1537,51 @@
                 <w:sz w:val="19"/>
                 <w:szCs w:val="19"/>
               </w:rPr>
+              <w:t xml:space="preserve">Chicken Tikka</w:t>
+            </w:r>
+            <w:r>
+              <w:rPr>
+                <w:rFonts w:ascii="Arial" w:cs="Arial" w:eastAsia="Arial" w:hAnsi="Arial"/>
+                <w:b/>
+                <w:bCs/>
+                <w:color w:val="16211C"/>
+                <w:sz w:val="19"/>
+                <w:szCs w:val="19"/>
+              </w:rPr>
+              <w:t xml:space="preserve">	£4.95</w:t>
+            </w:r>
+          </w:p>
+          <w:p>
+            <w:pPr>
+              <w:spacing w:after="50" w:before="0"/>
+            </w:pPr>
+            <w:r>
+              <w:rPr>
+                <w:rFonts w:ascii="Arial" w:cs="Arial" w:eastAsia="Arial" w:hAnsi="Arial"/>
+                <w:color w:val="5B655F"/>
+                <w:sz w:val="15"/>
+                <w:szCs w:val="15"/>
+              </w:rPr>
+              <w:t xml:space="preserve">Tender chicken pieces marinated in our flavourful homemade tikka spices, gently cooked with fried onions for extra depth.</w:t>
+            </w:r>
+          </w:p>
+          <w:p>
+            <w:pPr>
+              <w:keepNext/>
+              <w:tabs>
+                <w:tab w:val="right" w:pos="4966" w:leader="dot"/>
+              </w:tabs>
+              <w:spacing w:after="0" w:before="40"/>
+            </w:pPr>
+            <w:r>
+              <w:rPr>
+                <w:rFonts w:ascii="Arial" w:cs="Arial" w:eastAsia="Arial" w:hAnsi="Arial"/>
+                <w:b/>
+                <w:bCs/>
+                <w:color w:val="16211C"/>
+                <w:sz w:val="19"/>
+                <w:szCs w:val="19"/>
+              </w:rPr>
               <w:t xml:space="preserve">Fish Pakora</w:t>
             </w:r>
             <w:r>
@@ -1572,24 +1628,7 @@
                 <w:sz w:val="24"/>
                 <w:szCs w:val="24"/>
               </w:rPr>
-              <w:t xml:space="preserve">CURRIES</w:t>
-            </w:r>
-          </w:p>
-          <w:p>
-            <w:pPr>
-              <w:keepNext/>
-              <w:spacing w:after="20" w:before="0"/>
-            </w:pPr>
-            <w:r>
-              <w:rPr>
-                <w:rFonts w:ascii="Arial" w:cs="Arial" w:eastAsia="Arial" w:hAnsi="Arial"/>
-                <w:i/>
-                <w:iCs/>
-                <w:color w:val="5B655F"/>
-                <w:sz w:val="15"/>
-                <w:szCs w:val="15"/>
-              </w:rPr>
-              <w:t xml:space="preserve">Spice level adjusted on request</w:t>
+              <w:t xml:space="preserve">SUNDRIES</w:t>
             </w:r>
           </w:p>
           <w:p>
@@ -1609,49 +1648,29 @@
                 <w:sz w:val="19"/>
                 <w:szCs w:val="19"/>
               </w:rPr>
-              <w:t xml:space="preserve">Chicken Curry</w:t>
-            </w:r>
-            <w:r>
-              <w:rPr>
-                <w:rFonts w:ascii="Arial" w:cs="Arial" w:eastAsia="Arial" w:hAnsi="Arial"/>
-                <w:color w:val="D0461B"/>
-                <w:sz w:val="14"/>
-                <w:szCs w:val="14"/>
-              </w:rPr>
-              <w:t xml:space="preserve"> ●</w:t>
-            </w:r>
-            <w:r>
-              <w:rPr>
-                <w:rFonts w:ascii="Arial" w:cs="Arial" w:eastAsia="Arial" w:hAnsi="Arial"/>
-                <w:b/>
-                <w:bCs/>
-                <w:color w:val="EDA01E"/>
-                <w:sz w:val="18"/>
-                <w:szCs w:val="18"/>
-              </w:rPr>
-              <w:t xml:space="preserve"> ★</w:t>
-            </w:r>
-            <w:r>
-              <w:rPr>
-                <w:rFonts w:ascii="Arial" w:cs="Arial" w:eastAsia="Arial" w:hAnsi="Arial"/>
-                <w:b/>
-                <w:bCs/>
-                <w:color w:val="B33A14"/>
-                <w:sz w:val="12"/>
-                <w:szCs w:val="12"/>
-              </w:rPr>
-              <w:t xml:space="preserve"> SPICE TO ORDER</w:t>
-            </w:r>
-            <w:r>
-              <w:rPr>
-                <w:rFonts w:ascii="Arial" w:cs="Arial" w:eastAsia="Arial" w:hAnsi="Arial"/>
-                <w:b/>
-                <w:bCs/>
-                <w:color w:val="16211C"/>
-                <w:sz w:val="19"/>
-                <w:szCs w:val="19"/>
-              </w:rPr>
-              <w:t xml:space="preserve">	£8.25</w:t>
+              <w:t xml:space="preserve">Paratha</w:t>
+            </w:r>
+            <w:r>
+              <w:rPr>
+                <w:rFonts w:ascii="Arial" w:cs="Arial" w:eastAsia="Arial" w:hAnsi="Arial"/>
+                <w:b/>
+                <w:bCs/>
+                <w:color w:val="006A4E"/>
+                <w:sz w:val="16"/>
+                <w:szCs w:val="16"/>
+              </w:rPr>
+              <w:t xml:space="preserve"> (V)</w:t>
+            </w:r>
+            <w:r>
+              <w:rPr>
+                <w:rFonts w:ascii="Arial" w:cs="Arial" w:eastAsia="Arial" w:hAnsi="Arial"/>
+                <w:b/>
+                <w:bCs/>
+                <w:color w:val="16211C"/>
+                <w:sz w:val="19"/>
+                <w:szCs w:val="19"/>
+              </w:rPr>
+              <w:t xml:space="preserve">	£1.95</w:t>
             </w:r>
           </w:p>
           <w:p>
@@ -1665,7 +1684,7 @@
                 <w:sz w:val="15"/>
                 <w:szCs w:val="15"/>
               </w:rPr>
-              <w:t xml:space="preserve">Tender, boneless, chicken breast pieces, slow-cooked in a rich, home style curry sauce, balanced with traditional spices for comforting flavour.</w:t>
+              <w:t xml:space="preserve">Soft, flaky flatbread, freshly cooked and perfect for scooping up curries.</w:t>
             </w:r>
           </w:p>
           <w:p>
@@ -1685,49 +1704,29 @@
                 <w:sz w:val="19"/>
                 <w:szCs w:val="19"/>
               </w:rPr>
-              <w:t xml:space="preserve">Lamb Curry</w:t>
-            </w:r>
-            <w:r>
-              <w:rPr>
-                <w:rFonts w:ascii="Arial" w:cs="Arial" w:eastAsia="Arial" w:hAnsi="Arial"/>
-                <w:color w:val="D0461B"/>
-                <w:sz w:val="14"/>
-                <w:szCs w:val="14"/>
-              </w:rPr>
-              <w:t xml:space="preserve"> ●</w:t>
-            </w:r>
-            <w:r>
-              <w:rPr>
-                <w:rFonts w:ascii="Arial" w:cs="Arial" w:eastAsia="Arial" w:hAnsi="Arial"/>
-                <w:b/>
-                <w:bCs/>
-                <w:color w:val="EDA01E"/>
-                <w:sz w:val="18"/>
-                <w:szCs w:val="18"/>
-              </w:rPr>
-              <w:t xml:space="preserve"> ★</w:t>
-            </w:r>
-            <w:r>
-              <w:rPr>
-                <w:rFonts w:ascii="Arial" w:cs="Arial" w:eastAsia="Arial" w:hAnsi="Arial"/>
-                <w:b/>
-                <w:bCs/>
-                <w:color w:val="B33A14"/>
-                <w:sz w:val="12"/>
-                <w:szCs w:val="12"/>
-              </w:rPr>
-              <w:t xml:space="preserve"> SPICE TO ORDER</w:t>
-            </w:r>
-            <w:r>
-              <w:rPr>
-                <w:rFonts w:ascii="Arial" w:cs="Arial" w:eastAsia="Arial" w:hAnsi="Arial"/>
-                <w:b/>
-                <w:bCs/>
-                <w:color w:val="16211C"/>
-                <w:sz w:val="19"/>
-                <w:szCs w:val="19"/>
-              </w:rPr>
-              <w:t xml:space="preserve">	£9.45</w:t>
+              <w:t xml:space="preserve">Boiled Rice</w:t>
+            </w:r>
+            <w:r>
+              <w:rPr>
+                <w:rFonts w:ascii="Arial" w:cs="Arial" w:eastAsia="Arial" w:hAnsi="Arial"/>
+                <w:b/>
+                <w:bCs/>
+                <w:color w:val="006A4E"/>
+                <w:sz w:val="16"/>
+                <w:szCs w:val="16"/>
+              </w:rPr>
+              <w:t xml:space="preserve"> (V)</w:t>
+            </w:r>
+            <w:r>
+              <w:rPr>
+                <w:rFonts w:ascii="Arial" w:cs="Arial" w:eastAsia="Arial" w:hAnsi="Arial"/>
+                <w:b/>
+                <w:bCs/>
+                <w:color w:val="16211C"/>
+                <w:sz w:val="19"/>
+                <w:szCs w:val="19"/>
+              </w:rPr>
+              <w:t xml:space="preserve">	£3.75</w:t>
             </w:r>
           </w:p>
           <w:p>
@@ -1741,7 +1740,7 @@
                 <w:sz w:val="15"/>
                 <w:szCs w:val="15"/>
               </w:rPr>
-              <w:t xml:space="preserve">Succulent boneless lamb, gently cooked until tender in a hearty, spiced curry sauce full of warmth and depth.</w:t>
+              <w:t xml:space="preserve">Steamed plain rice, light and fluffy — the perfect base for any curry.</w:t>
             </w:r>
           </w:p>
           <w:p>
@@ -1761,49 +1760,29 @@
                 <w:sz w:val="19"/>
                 <w:szCs w:val="19"/>
               </w:rPr>
-              <w:t xml:space="preserve">King Prawn Curry</w:t>
-            </w:r>
-            <w:r>
-              <w:rPr>
-                <w:rFonts w:ascii="Arial" w:cs="Arial" w:eastAsia="Arial" w:hAnsi="Arial"/>
-                <w:color w:val="D0461B"/>
-                <w:sz w:val="14"/>
-                <w:szCs w:val="14"/>
-              </w:rPr>
-              <w:t xml:space="preserve"> ●</w:t>
-            </w:r>
-            <w:r>
-              <w:rPr>
-                <w:rFonts w:ascii="Arial" w:cs="Arial" w:eastAsia="Arial" w:hAnsi="Arial"/>
-                <w:b/>
-                <w:bCs/>
-                <w:color w:val="EDA01E"/>
-                <w:sz w:val="18"/>
-                <w:szCs w:val="18"/>
-              </w:rPr>
-              <w:t xml:space="preserve"> ★</w:t>
-            </w:r>
-            <w:r>
-              <w:rPr>
-                <w:rFonts w:ascii="Arial" w:cs="Arial" w:eastAsia="Arial" w:hAnsi="Arial"/>
-                <w:b/>
-                <w:bCs/>
-                <w:color w:val="B33A14"/>
-                <w:sz w:val="12"/>
-                <w:szCs w:val="12"/>
-              </w:rPr>
-              <w:t xml:space="preserve"> SPICE TO ORDER</w:t>
-            </w:r>
-            <w:r>
-              <w:rPr>
-                <w:rFonts w:ascii="Arial" w:cs="Arial" w:eastAsia="Arial" w:hAnsi="Arial"/>
-                <w:b/>
-                <w:bCs/>
-                <w:color w:val="16211C"/>
-                <w:sz w:val="19"/>
-                <w:szCs w:val="19"/>
-              </w:rPr>
-              <w:t xml:space="preserve">	£9.95</w:t>
+              <w:t xml:space="preserve">Fried Rice</w:t>
+            </w:r>
+            <w:r>
+              <w:rPr>
+                <w:rFonts w:ascii="Arial" w:cs="Arial" w:eastAsia="Arial" w:hAnsi="Arial"/>
+                <w:b/>
+                <w:bCs/>
+                <w:color w:val="006A4E"/>
+                <w:sz w:val="16"/>
+                <w:szCs w:val="16"/>
+              </w:rPr>
+              <w:t xml:space="preserve"> (V)</w:t>
+            </w:r>
+            <w:r>
+              <w:rPr>
+                <w:rFonts w:ascii="Arial" w:cs="Arial" w:eastAsia="Arial" w:hAnsi="Arial"/>
+                <w:b/>
+                <w:bCs/>
+                <w:color w:val="16211C"/>
+                <w:sz w:val="19"/>
+                <w:szCs w:val="19"/>
+              </w:rPr>
+              <w:t xml:space="preserve">	£4.45</w:t>
             </w:r>
           </w:p>
           <w:p>
@@ -1817,7 +1796,7 @@
                 <w:sz w:val="15"/>
                 <w:szCs w:val="15"/>
               </w:rPr>
-              <w:t xml:space="preserve">Juicy king prawns cooked in a fragrant, lightly spiced curry sauce — comforting, rich and perfectly balanced.</w:t>
+              <w:t xml:space="preserve">Lightly fried rice seasoned for flavour, simple and satisfying.</w:t>
             </w:r>
           </w:p>
           <w:p>
@@ -1837,7 +1816,72 @@
                 <w:sz w:val="19"/>
                 <w:szCs w:val="19"/>
               </w:rPr>
-              <w:t xml:space="preserve">Tarka Dhal</w:t>
+              <w:t xml:space="preserve">Chips</w:t>
+            </w:r>
+            <w:r>
+              <w:rPr>
+                <w:rFonts w:ascii="Arial" w:cs="Arial" w:eastAsia="Arial" w:hAnsi="Arial"/>
+                <w:b/>
+                <w:bCs/>
+                <w:color w:val="006A4E"/>
+                <w:sz w:val="16"/>
+                <w:szCs w:val="16"/>
+              </w:rPr>
+              <w:t xml:space="preserve"> (V)</w:t>
+            </w:r>
+            <w:r>
+              <w:rPr>
+                <w:rFonts w:ascii="Arial" w:cs="Arial" w:eastAsia="Arial" w:hAnsi="Arial"/>
+                <w:b/>
+                <w:bCs/>
+                <w:color w:val="16211C"/>
+                <w:sz w:val="19"/>
+                <w:szCs w:val="19"/>
+              </w:rPr>
+              <w:t xml:space="preserve">	£3.25</w:t>
+            </w:r>
+          </w:p>
+          <w:p>
+            <w:pPr>
+              <w:spacing w:after="50" w:before="0"/>
+            </w:pPr>
+            <w:r>
+              <w:rPr>
+                <w:rFonts w:ascii="Arial" w:cs="Arial" w:eastAsia="Arial" w:hAnsi="Arial"/>
+                <w:color w:val="5B655F"/>
+                <w:sz w:val="15"/>
+                <w:szCs w:val="15"/>
+              </w:rPr>
+              <w:t xml:space="preserve">Classic golden chips, freshly cooked and crisp.</w:t>
+            </w:r>
+          </w:p>
+          <w:p>
+            <w:pPr>
+              <w:keepNext/>
+              <w:tabs>
+                <w:tab w:val="right" w:pos="4966" w:leader="dot"/>
+              </w:tabs>
+              <w:spacing w:after="0" w:before="40"/>
+            </w:pPr>
+            <w:r>
+              <w:rPr>
+                <w:rFonts w:ascii="Arial" w:cs="Arial" w:eastAsia="Arial" w:hAnsi="Arial"/>
+                <w:b/>
+                <w:bCs/>
+                <w:color w:val="16211C"/>
+                <w:sz w:val="19"/>
+                <w:szCs w:val="19"/>
+              </w:rPr>
+              <w:t xml:space="preserve">Masala Chips</w:t>
+            </w:r>
+            <w:r>
+              <w:rPr>
+                <w:rFonts w:ascii="Arial" w:cs="Arial" w:eastAsia="Arial" w:hAnsi="Arial"/>
+                <w:color w:val="D0461B"/>
+                <w:sz w:val="14"/>
+                <w:szCs w:val="14"/>
+              </w:rPr>
+              <w:t xml:space="preserve"> ●●</w:t>
             </w:r>
             <w:r>
               <w:rPr>
@@ -1870,7 +1914,7 @@
                 <w:sz w:val="19"/>
                 <w:szCs w:val="19"/>
               </w:rPr>
-              <w:t xml:space="preserve">	£6.95</w:t>
+              <w:t xml:space="preserve">	£4.95</w:t>
             </w:r>
           </w:p>
           <w:p>
@@ -1884,43 +1928,28 @@
                 <w:sz w:val="15"/>
                 <w:szCs w:val="15"/>
               </w:rPr>
-              <w:t xml:space="preserve">A lentil curry slow-cooked until soft and creamy, finished with a fragrant tarka of garlic, onions and warming spices.</w:t>
-            </w:r>
-          </w:p>
-          <w:p>
-            <w:pPr>
-              <w:spacing w:after="20" w:before="160"/>
-            </w:pPr>
-            <w:r>
-              <w:rPr>
-                <w:rFonts w:ascii="Arial" w:cs="Arial" w:eastAsia="Arial" w:hAnsi="Arial"/>
-                <w:b/>
-                <w:bCs/>
-                <w:color w:val="006A4E"/>
-                <w:sz w:val="17"/>
-                <w:szCs w:val="17"/>
-              </w:rPr>
-              <w:t xml:space="preserve">SPICE TO ORDER</w:t>
-            </w:r>
-          </w:p>
-          <w:p>
-            <w:pPr>
-              <w:spacing w:after="20" w:before="0"/>
-            </w:pPr>
-            <w:r>
-              <w:rPr>
-                <w:rFonts w:ascii="Arial" w:cs="Arial" w:eastAsia="Arial" w:hAnsi="Arial"/>
-                <w:color w:val="16211C"/>
-                <w:sz w:val="15"/>
-                <w:szCs w:val="15"/>
-              </w:rPr>
-              <w:t xml:space="preserve">Curries can be made as hot as you like — choose when you order:</w:t>
-            </w:r>
-          </w:p>
-          <w:p>
-            <w:pPr>
-              <w:spacing w:after="0" w:before="0"/>
-            </w:pPr>
+              <w:t xml:space="preserve">Crispy chips tossed in warming masala spices for a bold, flavourful twist.</w:t>
+            </w:r>
+          </w:p>
+          <w:p>
+            <w:pPr>
+              <w:keepNext/>
+              <w:tabs>
+                <w:tab w:val="right" w:pos="4966" w:leader="dot"/>
+              </w:tabs>
+              <w:spacing w:after="0" w:before="40"/>
+            </w:pPr>
+            <w:r>
+              <w:rPr>
+                <w:rFonts w:ascii="Arial" w:cs="Arial" w:eastAsia="Arial" w:hAnsi="Arial"/>
+                <w:b/>
+                <w:bCs/>
+                <w:color w:val="16211C"/>
+                <w:sz w:val="19"/>
+                <w:szCs w:val="19"/>
+              </w:rPr>
+              <w:t xml:space="preserve">Biran Bread</w:t>
+            </w:r>
             <w:r>
               <w:rPr>
                 <w:rFonts w:ascii="Arial" w:cs="Arial" w:eastAsia="Arial" w:hAnsi="Arial"/>
@@ -1933,65 +1962,49 @@
             <w:r>
               <w:rPr>
                 <w:rFonts w:ascii="Arial" w:cs="Arial" w:eastAsia="Arial" w:hAnsi="Arial"/>
-                <w:color w:val="16211C"/>
+                <w:b/>
+                <w:bCs/>
+                <w:color w:val="EDA01E"/>
+                <w:sz w:val="18"/>
+                <w:szCs w:val="18"/>
+              </w:rPr>
+              <w:t xml:space="preserve"> ★</w:t>
+            </w:r>
+            <w:r>
+              <w:rPr>
+                <w:rFonts w:ascii="Arial" w:cs="Arial" w:eastAsia="Arial" w:hAnsi="Arial"/>
+                <w:b/>
+                <w:bCs/>
+                <w:color w:val="006A4E"/>
+                <w:sz w:val="16"/>
+                <w:szCs w:val="16"/>
+              </w:rPr>
+              <w:t xml:space="preserve"> (V)</w:t>
+            </w:r>
+            <w:r>
+              <w:rPr>
+                <w:rFonts w:ascii="Arial" w:cs="Arial" w:eastAsia="Arial" w:hAnsi="Arial"/>
+                <w:b/>
+                <w:bCs/>
+                <w:color w:val="16211C"/>
+                <w:sz w:val="19"/>
+                <w:szCs w:val="19"/>
+              </w:rPr>
+              <w:t xml:space="preserve">	£3.95</w:t>
+            </w:r>
+          </w:p>
+          <w:p>
+            <w:pPr>
+              <w:spacing w:after="50" w:before="0"/>
+            </w:pPr>
+            <w:r>
+              <w:rPr>
+                <w:rFonts w:ascii="Arial" w:cs="Arial" w:eastAsia="Arial" w:hAnsi="Arial"/>
+                <w:color w:val="5B655F"/>
                 <w:sz w:val="15"/>
                 <w:szCs w:val="15"/>
               </w:rPr>
-              <w:t xml:space="preserve"> Slightly hot   </w:t>
-            </w:r>
-            <w:r>
-              <w:rPr>
-                <w:rFonts w:ascii="Arial" w:cs="Arial" w:eastAsia="Arial" w:hAnsi="Arial"/>
-                <w:color w:val="D0461B"/>
-                <w:sz w:val="14"/>
-                <w:szCs w:val="14"/>
-              </w:rPr>
-              <w:t xml:space="preserve"> ●●</w:t>
-            </w:r>
-            <w:r>
-              <w:rPr>
-                <w:rFonts w:ascii="Arial" w:cs="Arial" w:eastAsia="Arial" w:hAnsi="Arial"/>
-                <w:color w:val="16211C"/>
-                <w:sz w:val="15"/>
-                <w:szCs w:val="15"/>
-              </w:rPr>
-              <w:t xml:space="preserve"> Hot   </w:t>
-            </w:r>
-            <w:r>
-              <w:rPr>
-                <w:rFonts w:ascii="Arial" w:cs="Arial" w:eastAsia="Arial" w:hAnsi="Arial"/>
-                <w:color w:val="D0461B"/>
-                <w:sz w:val="14"/>
-                <w:szCs w:val="14"/>
-              </w:rPr>
-              <w:t xml:space="preserve"> ●●●</w:t>
-            </w:r>
-            <w:r>
-              <w:rPr>
-                <w:rFonts w:ascii="Arial" w:cs="Arial" w:eastAsia="Arial" w:hAnsi="Arial"/>
-                <w:color w:val="16211C"/>
-                <w:sz w:val="15"/>
-                <w:szCs w:val="15"/>
-              </w:rPr>
-              <w:t xml:space="preserve"> Madras +30p   </w:t>
-            </w:r>
-            <w:r>
-              <w:rPr>
-                <w:rFonts w:ascii="Arial" w:cs="Arial" w:eastAsia="Arial" w:hAnsi="Arial"/>
-                <w:color w:val="D0461B"/>
-                <w:sz w:val="14"/>
-                <w:szCs w:val="14"/>
-              </w:rPr>
-              <w:t xml:space="preserve"> ●●●●</w:t>
-            </w:r>
-            <w:r>
-              <w:rPr>
-                <w:rFonts w:ascii="Arial" w:cs="Arial" w:eastAsia="Arial" w:hAnsi="Arial"/>
-                <w:color w:val="16211C"/>
-                <w:sz w:val="15"/>
-                <w:szCs w:val="15"/>
-              </w:rPr>
-              <w:t xml:space="preserve"> Vindaloo +30p</w:t>
+              <w:t xml:space="preserve">Traditional street style bread stir-fry with onions and warming spices, finished with fresh coriander for a comforting, savoury bite.</w:t>
             </w:r>
           </w:p>
         </w:tc>
@@ -2062,7 +2075,24 @@
                 <w:sz w:val="24"/>
                 <w:szCs w:val="24"/>
               </w:rPr>
-              <w:t xml:space="preserve">SUNDRIES</w:t>
+              <w:t xml:space="preserve">CURRIES</w:t>
+            </w:r>
+          </w:p>
+          <w:p>
+            <w:pPr>
+              <w:keepNext/>
+              <w:spacing w:after="20" w:before="0"/>
+            </w:pPr>
+            <w:r>
+              <w:rPr>
+                <w:rFonts w:ascii="Arial" w:cs="Arial" w:eastAsia="Arial" w:hAnsi="Arial"/>
+                <w:i/>
+                <w:iCs/>
+                <w:color w:val="5B655F"/>
+                <w:sz w:val="15"/>
+                <w:szCs w:val="15"/>
+              </w:rPr>
+              <w:t xml:space="preserve">Spice level adjusted on request</w:t>
             </w:r>
           </w:p>
           <w:p>
@@ -2082,29 +2112,49 @@
                 <w:sz w:val="19"/>
                 <w:szCs w:val="19"/>
               </w:rPr>
-              <w:t xml:space="preserve">Paratha</w:t>
-            </w:r>
-            <w:r>
-              <w:rPr>
-                <w:rFonts w:ascii="Arial" w:cs="Arial" w:eastAsia="Arial" w:hAnsi="Arial"/>
-                <w:b/>
-                <w:bCs/>
-                <w:color w:val="006A4E"/>
-                <w:sz w:val="16"/>
-                <w:szCs w:val="16"/>
-              </w:rPr>
-              <w:t xml:space="preserve"> (V)</w:t>
-            </w:r>
-            <w:r>
-              <w:rPr>
-                <w:rFonts w:ascii="Arial" w:cs="Arial" w:eastAsia="Arial" w:hAnsi="Arial"/>
-                <w:b/>
-                <w:bCs/>
-                <w:color w:val="16211C"/>
-                <w:sz w:val="19"/>
-                <w:szCs w:val="19"/>
-              </w:rPr>
-              <w:t xml:space="preserve">	£1.95</w:t>
+              <w:t xml:space="preserve">Chicken Curry</w:t>
+            </w:r>
+            <w:r>
+              <w:rPr>
+                <w:rFonts w:ascii="Arial" w:cs="Arial" w:eastAsia="Arial" w:hAnsi="Arial"/>
+                <w:color w:val="D0461B"/>
+                <w:sz w:val="14"/>
+                <w:szCs w:val="14"/>
+              </w:rPr>
+              <w:t xml:space="preserve"> ●</w:t>
+            </w:r>
+            <w:r>
+              <w:rPr>
+                <w:rFonts w:ascii="Arial" w:cs="Arial" w:eastAsia="Arial" w:hAnsi="Arial"/>
+                <w:b/>
+                <w:bCs/>
+                <w:color w:val="EDA01E"/>
+                <w:sz w:val="18"/>
+                <w:szCs w:val="18"/>
+              </w:rPr>
+              <w:t xml:space="preserve"> ★</w:t>
+            </w:r>
+            <w:r>
+              <w:rPr>
+                <w:rFonts w:ascii="Arial" w:cs="Arial" w:eastAsia="Arial" w:hAnsi="Arial"/>
+                <w:b/>
+                <w:bCs/>
+                <w:color w:val="B33A14"/>
+                <w:sz w:val="12"/>
+                <w:szCs w:val="12"/>
+              </w:rPr>
+              <w:t xml:space="preserve"> SPICE TO ORDER</w:t>
+            </w:r>
+            <w:r>
+              <w:rPr>
+                <w:rFonts w:ascii="Arial" w:cs="Arial" w:eastAsia="Arial" w:hAnsi="Arial"/>
+                <w:b/>
+                <w:bCs/>
+                <w:color w:val="16211C"/>
+                <w:sz w:val="19"/>
+                <w:szCs w:val="19"/>
+              </w:rPr>
+              <w:t xml:space="preserve">	£8.25</w:t>
             </w:r>
           </w:p>
           <w:p>
@@ -2118,7 +2168,7 @@
                 <w:sz w:val="15"/>
                 <w:szCs w:val="15"/>
               </w:rPr>
-              <w:t xml:space="preserve">Soft, flaky flatbread, freshly cooked and perfect for scooping up curries.</w:t>
+              <w:t xml:space="preserve">Tender, boneless, chicken breast pieces, slow-cooked in a rich, home style curry sauce, balanced with traditional spices for comforting flavour.</w:t>
             </w:r>
           </w:p>
           <w:p>
@@ -2138,29 +2188,49 @@
                 <w:sz w:val="19"/>
                 <w:szCs w:val="19"/>
               </w:rPr>
-              <w:t xml:space="preserve">Boiled Rice</w:t>
-            </w:r>
-            <w:r>
-              <w:rPr>
-                <w:rFonts w:ascii="Arial" w:cs="Arial" w:eastAsia="Arial" w:hAnsi="Arial"/>
-                <w:b/>
-                <w:bCs/>
-                <w:color w:val="006A4E"/>
-                <w:sz w:val="16"/>
-                <w:szCs w:val="16"/>
-              </w:rPr>
-              <w:t xml:space="preserve"> (V)</w:t>
-            </w:r>
-            <w:r>
-              <w:rPr>
-                <w:rFonts w:ascii="Arial" w:cs="Arial" w:eastAsia="Arial" w:hAnsi="Arial"/>
-                <w:b/>
-                <w:bCs/>
-                <w:color w:val="16211C"/>
-                <w:sz w:val="19"/>
-                <w:szCs w:val="19"/>
-              </w:rPr>
-              <w:t xml:space="preserve">	£3.75</w:t>
+              <w:t xml:space="preserve">Lamb Curry</w:t>
+            </w:r>
+            <w:r>
+              <w:rPr>
+                <w:rFonts w:ascii="Arial" w:cs="Arial" w:eastAsia="Arial" w:hAnsi="Arial"/>
+                <w:color w:val="D0461B"/>
+                <w:sz w:val="14"/>
+                <w:szCs w:val="14"/>
+              </w:rPr>
+              <w:t xml:space="preserve"> ●</w:t>
+            </w:r>
+            <w:r>
+              <w:rPr>
+                <w:rFonts w:ascii="Arial" w:cs="Arial" w:eastAsia="Arial" w:hAnsi="Arial"/>
+                <w:b/>
+                <w:bCs/>
+                <w:color w:val="EDA01E"/>
+                <w:sz w:val="18"/>
+                <w:szCs w:val="18"/>
+              </w:rPr>
+              <w:t xml:space="preserve"> ★</w:t>
+            </w:r>
+            <w:r>
+              <w:rPr>
+                <w:rFonts w:ascii="Arial" w:cs="Arial" w:eastAsia="Arial" w:hAnsi="Arial"/>
+                <w:b/>
+                <w:bCs/>
+                <w:color w:val="B33A14"/>
+                <w:sz w:val="12"/>
+                <w:szCs w:val="12"/>
+              </w:rPr>
+              <w:t xml:space="preserve"> SPICE TO ORDER</w:t>
+            </w:r>
+            <w:r>
+              <w:rPr>
+                <w:rFonts w:ascii="Arial" w:cs="Arial" w:eastAsia="Arial" w:hAnsi="Arial"/>
+                <w:b/>
+                <w:bCs/>
+                <w:color w:val="16211C"/>
+                <w:sz w:val="19"/>
+                <w:szCs w:val="19"/>
+              </w:rPr>
+              <w:t xml:space="preserve">	£9.45</w:t>
             </w:r>
           </w:p>
           <w:p>
@@ -2174,7 +2244,7 @@
                 <w:sz w:val="15"/>
                 <w:szCs w:val="15"/>
               </w:rPr>
-              <w:t xml:space="preserve">Steamed plain rice, light and fluffy — the perfect base for any curry.</w:t>
+              <w:t xml:space="preserve">Succulent boneless lamb, gently cooked until tender in a hearty, spiced curry sauce full of warmth and depth.</w:t>
             </w:r>
           </w:p>
           <w:p>
@@ -2194,29 +2264,49 @@
                 <w:sz w:val="19"/>
                 <w:szCs w:val="19"/>
               </w:rPr>
-              <w:t xml:space="preserve">Fried Rice</w:t>
-            </w:r>
-            <w:r>
-              <w:rPr>
-                <w:rFonts w:ascii="Arial" w:cs="Arial" w:eastAsia="Arial" w:hAnsi="Arial"/>
-                <w:b/>
-                <w:bCs/>
-                <w:color w:val="006A4E"/>
-                <w:sz w:val="16"/>
-                <w:szCs w:val="16"/>
-              </w:rPr>
-              <w:t xml:space="preserve"> (V)</w:t>
-            </w:r>
-            <w:r>
-              <w:rPr>
-                <w:rFonts w:ascii="Arial" w:cs="Arial" w:eastAsia="Arial" w:hAnsi="Arial"/>
-                <w:b/>
-                <w:bCs/>
-                <w:color w:val="16211C"/>
-                <w:sz w:val="19"/>
-                <w:szCs w:val="19"/>
-              </w:rPr>
-              <w:t xml:space="preserve">	£4.45</w:t>
+              <w:t xml:space="preserve">King Prawn Curry</w:t>
+            </w:r>
+            <w:r>
+              <w:rPr>
+                <w:rFonts w:ascii="Arial" w:cs="Arial" w:eastAsia="Arial" w:hAnsi="Arial"/>
+                <w:color w:val="D0461B"/>
+                <w:sz w:val="14"/>
+                <w:szCs w:val="14"/>
+              </w:rPr>
+              <w:t xml:space="preserve"> ●</w:t>
+            </w:r>
+            <w:r>
+              <w:rPr>
+                <w:rFonts w:ascii="Arial" w:cs="Arial" w:eastAsia="Arial" w:hAnsi="Arial"/>
+                <w:b/>
+                <w:bCs/>
+                <w:color w:val="EDA01E"/>
+                <w:sz w:val="18"/>
+                <w:szCs w:val="18"/>
+              </w:rPr>
+              <w:t xml:space="preserve"> ★</w:t>
+            </w:r>
+            <w:r>
+              <w:rPr>
+                <w:rFonts w:ascii="Arial" w:cs="Arial" w:eastAsia="Arial" w:hAnsi="Arial"/>
+                <w:b/>
+                <w:bCs/>
+                <w:color w:val="B33A14"/>
+                <w:sz w:val="12"/>
+                <w:szCs w:val="12"/>
+              </w:rPr>
+              <w:t xml:space="preserve"> SPICE TO ORDER</w:t>
+            </w:r>
+            <w:r>
+              <w:rPr>
+                <w:rFonts w:ascii="Arial" w:cs="Arial" w:eastAsia="Arial" w:hAnsi="Arial"/>
+                <w:b/>
+                <w:bCs/>
+                <w:color w:val="16211C"/>
+                <w:sz w:val="19"/>
+                <w:szCs w:val="19"/>
+              </w:rPr>
+              <w:t xml:space="preserve">	£9.95</w:t>
             </w:r>
           </w:p>
           <w:p>
@@ -2230,7 +2320,7 @@
                 <w:sz w:val="15"/>
                 <w:szCs w:val="15"/>
               </w:rPr>
-              <w:t xml:space="preserve">Lightly fried rice seasoned for flavour, simple and satisfying.</w:t>
+              <w:t xml:space="preserve">Juicy king prawns cooked in a fragrant, lightly spiced curry sauce — comforting, rich and perfectly balanced.</w:t>
             </w:r>
           </w:p>
           <w:p>
@@ -2250,7 +2340,18 @@
                 <w:sz w:val="19"/>
                 <w:szCs w:val="19"/>
               </w:rPr>
-              <w:t xml:space="preserve">Chips</w:t>
+              <w:t xml:space="preserve">Tarka Dhal</w:t>
+            </w:r>
+            <w:r>
+              <w:rPr>
+                <w:rFonts w:ascii="Arial" w:cs="Arial" w:eastAsia="Arial" w:hAnsi="Arial"/>
+                <w:b/>
+                <w:bCs/>
+                <w:color w:val="EDA01E"/>
+                <w:sz w:val="18"/>
+                <w:szCs w:val="18"/>
+              </w:rPr>
+              <w:t xml:space="preserve"> ★</w:t>
             </w:r>
             <w:r>
               <w:rPr>
@@ -2272,7 +2373,7 @@
                 <w:sz w:val="19"/>
                 <w:szCs w:val="19"/>
               </w:rPr>
-              <w:t xml:space="preserve">	£3.25</w:t>
+              <w:t xml:space="preserve">	£6.95</w:t>
             </w:r>
           </w:p>
           <w:p>
@@ -2286,28 +2387,43 @@
                 <w:sz w:val="15"/>
                 <w:szCs w:val="15"/>
               </w:rPr>
-              <w:t xml:space="preserve">Classic golden chips, freshly cooked and crisp.</w:t>
-            </w:r>
-          </w:p>
-          <w:p>
-            <w:pPr>
-              <w:keepNext/>
-              <w:tabs>
-                <w:tab w:val="right" w:pos="4966" w:leader="dot"/>
-              </w:tabs>
-              <w:spacing w:after="0" w:before="40"/>
-            </w:pPr>
-            <w:r>
-              <w:rPr>
-                <w:rFonts w:ascii="Arial" w:cs="Arial" w:eastAsia="Arial" w:hAnsi="Arial"/>
-                <w:b/>
-                <w:bCs/>
-                <w:color w:val="16211C"/>
-                <w:sz w:val="19"/>
-                <w:szCs w:val="19"/>
-              </w:rPr>
-              <w:t xml:space="preserve">Masala Chips</w:t>
-            </w:r>
+              <w:t xml:space="preserve">A lentil curry slow-cooked until soft and creamy, finished with a fragrant tarka of garlic, onions and warming spices.</w:t>
+            </w:r>
+          </w:p>
+          <w:p>
+            <w:pPr>
+              <w:spacing w:after="20" w:before="160"/>
+            </w:pPr>
+            <w:r>
+              <w:rPr>
+                <w:rFonts w:ascii="Arial" w:cs="Arial" w:eastAsia="Arial" w:hAnsi="Arial"/>
+                <w:b/>
+                <w:bCs/>
+                <w:color w:val="006A4E"/>
+                <w:sz w:val="17"/>
+                <w:szCs w:val="17"/>
+              </w:rPr>
+              <w:t xml:space="preserve">SPICE TO ORDER</w:t>
+            </w:r>
+          </w:p>
+          <w:p>
+            <w:pPr>
+              <w:spacing w:after="20" w:before="0"/>
+            </w:pPr>
+            <w:r>
+              <w:rPr>
+                <w:rFonts w:ascii="Arial" w:cs="Arial" w:eastAsia="Arial" w:hAnsi="Arial"/>
+                <w:color w:val="16211C"/>
+                <w:sz w:val="15"/>
+                <w:szCs w:val="15"/>
+              </w:rPr>
+              <w:t xml:space="preserve">Curries can be made as hot as you like — choose when you order:</w:t>
+            </w:r>
+          </w:p>
+          <w:p>
+            <w:pPr>
+              <w:spacing w:after="0" w:before="0"/>
+            </w:pPr>
             <w:r>
               <w:rPr>
                 <w:rFonts w:ascii="Arial" w:cs="Arial" w:eastAsia="Arial" w:hAnsi="Arial"/>
@@ -2315,74 +2431,16 @@
                 <w:sz w:val="14"/>
                 <w:szCs w:val="14"/>
               </w:rPr>
-              <w:t xml:space="preserve"> ●●</w:t>
-            </w:r>
-            <w:r>
-              <w:rPr>
-                <w:rFonts w:ascii="Arial" w:cs="Arial" w:eastAsia="Arial" w:hAnsi="Arial"/>
-                <w:b/>
-                <w:bCs/>
-                <w:color w:val="EDA01E"/>
-                <w:sz w:val="18"/>
-                <w:szCs w:val="18"/>
-              </w:rPr>
-              <w:t xml:space="preserve"> ★</w:t>
-            </w:r>
-            <w:r>
-              <w:rPr>
-                <w:rFonts w:ascii="Arial" w:cs="Arial" w:eastAsia="Arial" w:hAnsi="Arial"/>
-                <w:b/>
-                <w:bCs/>
-                <w:color w:val="006A4E"/>
-                <w:sz w:val="16"/>
-                <w:szCs w:val="16"/>
-              </w:rPr>
-              <w:t xml:space="preserve"> (V)</w:t>
-            </w:r>
-            <w:r>
-              <w:rPr>
-                <w:rFonts w:ascii="Arial" w:cs="Arial" w:eastAsia="Arial" w:hAnsi="Arial"/>
-                <w:b/>
-                <w:bCs/>
-                <w:color w:val="16211C"/>
-                <w:sz w:val="19"/>
-                <w:szCs w:val="19"/>
-              </w:rPr>
-              <w:t xml:space="preserve">	£4.95</w:t>
-            </w:r>
-          </w:p>
-          <w:p>
-            <w:pPr>
-              <w:spacing w:after="50" w:before="0"/>
-            </w:pPr>
-            <w:r>
-              <w:rPr>
-                <w:rFonts w:ascii="Arial" w:cs="Arial" w:eastAsia="Arial" w:hAnsi="Arial"/>
-                <w:color w:val="5B655F"/>
+              <w:t xml:space="preserve"> ●</w:t>
+            </w:r>
+            <w:r>
+              <w:rPr>
+                <w:rFonts w:ascii="Arial" w:cs="Arial" w:eastAsia="Arial" w:hAnsi="Arial"/>
+                <w:color w:val="16211C"/>
                 <w:sz w:val="15"/>
                 <w:szCs w:val="15"/>
               </w:rPr>
-              <w:t xml:space="preserve">Crispy chips tossed in warming masala spices for a bold, flavourful twist.</w:t>
-            </w:r>
-          </w:p>
-          <w:p>
-            <w:pPr>
-              <w:keepNext/>
-              <w:tabs>
-                <w:tab w:val="right" w:pos="4966" w:leader="dot"/>
-              </w:tabs>
-              <w:spacing w:after="0" w:before="40"/>
-            </w:pPr>
-            <w:r>
-              <w:rPr>
-                <w:rFonts w:ascii="Arial" w:cs="Arial" w:eastAsia="Arial" w:hAnsi="Arial"/>
-                <w:b/>
-                <w:bCs/>
-                <w:color w:val="16211C"/>
-                <w:sz w:val="19"/>
-                <w:szCs w:val="19"/>
-              </w:rPr>
-              <w:t xml:space="preserve">Biran Bread</w:t>
+              <w:t xml:space="preserve"> Slightly hot   </w:t>
             </w:r>
             <w:r>
               <w:rPr>
@@ -2391,54 +2449,52 @@
                 <w:sz w:val="14"/>
                 <w:szCs w:val="14"/>
               </w:rPr>
-              <w:t xml:space="preserve"> ●</w:t>
-            </w:r>
-            <w:r>
-              <w:rPr>
-                <w:rFonts w:ascii="Arial" w:cs="Arial" w:eastAsia="Arial" w:hAnsi="Arial"/>
-                <w:b/>
-                <w:bCs/>
-                <w:color w:val="EDA01E"/>
-                <w:sz w:val="18"/>
-                <w:szCs w:val="18"/>
-              </w:rPr>
-              <w:t xml:space="preserve"> ★</w:t>
-            </w:r>
-            <w:r>
-              <w:rPr>
-                <w:rFonts w:ascii="Arial" w:cs="Arial" w:eastAsia="Arial" w:hAnsi="Arial"/>
-                <w:b/>
-                <w:bCs/>
-                <w:color w:val="006A4E"/>
-                <w:sz w:val="16"/>
-                <w:szCs w:val="16"/>
-              </w:rPr>
-              <w:t xml:space="preserve"> (V)</w:t>
-            </w:r>
-            <w:r>
-              <w:rPr>
-                <w:rFonts w:ascii="Arial" w:cs="Arial" w:eastAsia="Arial" w:hAnsi="Arial"/>
-                <w:b/>
-                <w:bCs/>
-                <w:color w:val="16211C"/>
-                <w:sz w:val="19"/>
-                <w:szCs w:val="19"/>
-              </w:rPr>
-              <w:t xml:space="preserve">	£3.95</w:t>
-            </w:r>
-          </w:p>
-          <w:p>
-            <w:pPr>
-              <w:spacing w:after="50" w:before="0"/>
-            </w:pPr>
-            <w:r>
-              <w:rPr>
-                <w:rFonts w:ascii="Arial" w:cs="Arial" w:eastAsia="Arial" w:hAnsi="Arial"/>
-                <w:color w:val="5B655F"/>
+              <w:t xml:space="preserve"> ●●</w:t>
+            </w:r>
+            <w:r>
+              <w:rPr>
+                <w:rFonts w:ascii="Arial" w:cs="Arial" w:eastAsia="Arial" w:hAnsi="Arial"/>
+                <w:color w:val="16211C"/>
                 <w:sz w:val="15"/>
                 <w:szCs w:val="15"/>
               </w:rPr>
-              <w:t xml:space="preserve">Traditional street style bread stir-fry with onions and warming spices, finished with fresh coriander for a comforting, savoury bite.</w:t>
+              <w:t xml:space="preserve"> Hot   </w:t>
+            </w:r>
+            <w:r>
+              <w:rPr>
+                <w:rFonts w:ascii="Arial" w:cs="Arial" w:eastAsia="Arial" w:hAnsi="Arial"/>
+                <w:color w:val="D0461B"/>
+                <w:sz w:val="14"/>
+                <w:szCs w:val="14"/>
+              </w:rPr>
+              <w:t xml:space="preserve"> ●●●</w:t>
+            </w:r>
+            <w:r>
+              <w:rPr>
+                <w:rFonts w:ascii="Arial" w:cs="Arial" w:eastAsia="Arial" w:hAnsi="Arial"/>
+                <w:color w:val="16211C"/>
+                <w:sz w:val="15"/>
+                <w:szCs w:val="15"/>
+              </w:rPr>
+              <w:t xml:space="preserve"> Madras +30p   </w:t>
+            </w:r>
+            <w:r>
+              <w:rPr>
+                <w:rFonts w:ascii="Arial" w:cs="Arial" w:eastAsia="Arial" w:hAnsi="Arial"/>
+                <w:color w:val="D0461B"/>
+                <w:sz w:val="14"/>
+                <w:szCs w:val="14"/>
+              </w:rPr>
+              <w:t xml:space="preserve"> ●●●●</w:t>
+            </w:r>
+            <w:r>
+              <w:rPr>
+                <w:rFonts w:ascii="Arial" w:cs="Arial" w:eastAsia="Arial" w:hAnsi="Arial"/>
+                <w:color w:val="16211C"/>
+                <w:sz w:val="15"/>
+                <w:szCs w:val="15"/>
+              </w:rPr>
+              <w:t xml:space="preserve"> Vindaloo +30p</w:t>
             </w:r>
           </w:p>
           <w:p>

</xml_diff>

<commit_message>
Flyer: note complimentary popadum with each curry
Co-Authored-By: Claude Opus 5.5 <noreply@anthropic.com>
Claude-Session: https://claude.ai/code/session_01WQg3TD9BK9rRRVRT1LJhsu
</commit_message>
<xml_diff>
--- a/marketing/Ghar-Masala-menu-flyer-EDITABLE.docx
+++ b/marketing/Ghar-Masala-menu-flyer-EDITABLE.docx
@@ -1342,7 +1342,7 @@
           </w:p>
           <w:p>
             <w:pPr>
-              <w:spacing w:after="50" w:before="0"/>
+              <w:spacing w:after="10" w:before="0"/>
             </w:pPr>
             <w:r>
               <w:rPr>
@@ -1352,6 +1352,22 @@
                 <w:szCs w:val="15"/>
               </w:rPr>
               <w:t xml:space="preserve">Crispy, light and deliciously crunchy poppadoms, perfect for enjoying alongside your favourite curry or as a tasty starter.</w:t>
+            </w:r>
+          </w:p>
+          <w:p>
+            <w:pPr>
+              <w:spacing w:after="50" w:before="0"/>
+            </w:pPr>
+            <w:r>
+              <w:rPr>
+                <w:rFonts w:ascii="Arial" w:cs="Arial" w:eastAsia="Arial" w:hAnsi="Arial"/>
+                <w:b/>
+                <w:bCs/>
+                <w:color w:val="74490A"/>
+                <w:sz w:val="15"/>
+                <w:szCs w:val="15"/>
+              </w:rPr>
+              <w:t xml:space="preserve">✓ 1 complimentary popadum with each curry ordered</w:t>
             </w:r>
           </w:p>
           <w:p>

</xml_diff>

<commit_message>
Flyer: move spice-to-order key to the bottom with the other keys
Co-Authored-By: Claude Opus 5.5 <noreply@anthropic.com>
Claude-Session: https://claude.ai/code/session_01WQg3TD9BK9rRRVRT1LJhsu
</commit_message>
<xml_diff>
--- a/marketing/Ghar-Masala-menu-flyer-EDITABLE.docx
+++ b/marketing/Ghar-Masala-menu-flyer-EDITABLE.docx
@@ -2408,113 +2408,6 @@
           </w:p>
           <w:p>
             <w:pPr>
-              <w:spacing w:after="20" w:before="160"/>
-            </w:pPr>
-            <w:r>
-              <w:rPr>
-                <w:rFonts w:ascii="Arial" w:cs="Arial" w:eastAsia="Arial" w:hAnsi="Arial"/>
-                <w:b/>
-                <w:bCs/>
-                <w:color w:val="006A4E"/>
-                <w:sz w:val="17"/>
-                <w:szCs w:val="17"/>
-              </w:rPr>
-              <w:t xml:space="preserve">SPICE TO ORDER</w:t>
-            </w:r>
-          </w:p>
-          <w:p>
-            <w:pPr>
-              <w:spacing w:after="20" w:before="0"/>
-            </w:pPr>
-            <w:r>
-              <w:rPr>
-                <w:rFonts w:ascii="Arial" w:cs="Arial" w:eastAsia="Arial" w:hAnsi="Arial"/>
-                <w:color w:val="16211C"/>
-                <w:sz w:val="15"/>
-                <w:szCs w:val="15"/>
-              </w:rPr>
-              <w:t xml:space="preserve">Curries can be made as hot as you like — choose when you order:</w:t>
-            </w:r>
-          </w:p>
-          <w:p>
-            <w:pPr>
-              <w:spacing w:after="0" w:before="0"/>
-            </w:pPr>
-            <w:r>
-              <w:rPr>
-                <w:rFonts w:ascii="Arial" w:cs="Arial" w:eastAsia="Arial" w:hAnsi="Arial"/>
-                <w:color w:val="D0461B"/>
-                <w:sz w:val="14"/>
-                <w:szCs w:val="14"/>
-              </w:rPr>
-              <w:t xml:space="preserve"> ●</w:t>
-            </w:r>
-            <w:r>
-              <w:rPr>
-                <w:rFonts w:ascii="Arial" w:cs="Arial" w:eastAsia="Arial" w:hAnsi="Arial"/>
-                <w:color w:val="16211C"/>
-                <w:sz w:val="15"/>
-                <w:szCs w:val="15"/>
-              </w:rPr>
-              <w:t xml:space="preserve"> Slightly hot   </w:t>
-            </w:r>
-            <w:r>
-              <w:rPr>
-                <w:rFonts w:ascii="Arial" w:cs="Arial" w:eastAsia="Arial" w:hAnsi="Arial"/>
-                <w:color w:val="D0461B"/>
-                <w:sz w:val="14"/>
-                <w:szCs w:val="14"/>
-              </w:rPr>
-              <w:t xml:space="preserve"> ●●</w:t>
-            </w:r>
-            <w:r>
-              <w:rPr>
-                <w:rFonts w:ascii="Arial" w:cs="Arial" w:eastAsia="Arial" w:hAnsi="Arial"/>
-                <w:color w:val="16211C"/>
-                <w:sz w:val="15"/>
-                <w:szCs w:val="15"/>
-              </w:rPr>
-              <w:t xml:space="preserve"> Hot   </w:t>
-            </w:r>
-            <w:r>
-              <w:rPr>
-                <w:rFonts w:ascii="Arial" w:cs="Arial" w:eastAsia="Arial" w:hAnsi="Arial"/>
-                <w:color w:val="D0461B"/>
-                <w:sz w:val="14"/>
-                <w:szCs w:val="14"/>
-              </w:rPr>
-              <w:t xml:space="preserve"> ●●●</w:t>
-            </w:r>
-            <w:r>
-              <w:rPr>
-                <w:rFonts w:ascii="Arial" w:cs="Arial" w:eastAsia="Arial" w:hAnsi="Arial"/>
-                <w:color w:val="16211C"/>
-                <w:sz w:val="15"/>
-                <w:szCs w:val="15"/>
-              </w:rPr>
-              <w:t xml:space="preserve"> Madras +30p   </w:t>
-            </w:r>
-            <w:r>
-              <w:rPr>
-                <w:rFonts w:ascii="Arial" w:cs="Arial" w:eastAsia="Arial" w:hAnsi="Arial"/>
-                <w:color w:val="D0461B"/>
-                <w:sz w:val="14"/>
-                <w:szCs w:val="14"/>
-              </w:rPr>
-              <w:t xml:space="preserve"> ●●●●</w:t>
-            </w:r>
-            <w:r>
-              <w:rPr>
-                <w:rFonts w:ascii="Arial" w:cs="Arial" w:eastAsia="Arial" w:hAnsi="Arial"/>
-                <w:color w:val="16211C"/>
-                <w:sz w:val="15"/>
-                <w:szCs w:val="15"/>
-              </w:rPr>
-              <w:t xml:space="preserve"> Vindaloo +30p</w:t>
-            </w:r>
-          </w:p>
-          <w:p>
-            <w:pPr>
               <w:keepNext/>
               <w:pBdr>
                 <w:bottom w:val="single" w:color="EDA01E" w:sz="8" w:space="2"/>
@@ -2946,6 +2839,162 @@
           <w:szCs w:val="15"/>
         </w:rPr>
         <w:t xml:space="preserve"> Spice level    All meat is halal</w:t>
+      </w:r>
+    </w:p>
+    <w:tbl>
+      <w:tblPr>
+        <w:tblW w:type="dxa" w:w="10772"/>
+        <w:tblBorders>
+          <w:top w:val="none" w:color="FFFFFF" w:sz="0"/>
+          <w:left w:val="none" w:color="FFFFFF" w:sz="0"/>
+          <w:bottom w:val="none" w:color="FFFFFF" w:sz="0"/>
+          <w:right w:val="none" w:color="FFFFFF" w:sz="0"/>
+          <w:insideH w:val="none" w:color="FFFFFF" w:sz="0"/>
+          <w:insideV w:val="none" w:color="FFFFFF" w:sz="0"/>
+        </w:tblBorders>
+      </w:tblPr>
+      <w:tblGrid>
+        <w:gridCol w:w="10772"/>
+      </w:tblGrid>
+      <w:tr>
+        <w:tc>
+          <w:tcPr>
+            <w:tcW w:type="dxa" w:w="10772"/>
+            <w:tcBorders>
+              <w:top w:val="single" w:color="D9D4C8" w:sz="4"/>
+              <w:left w:val="single" w:color="D9D4C8" w:sz="4"/>
+              <w:bottom w:val="single" w:color="D9D4C8" w:sz="4"/>
+              <w:right w:val="single" w:color="D9D4C8" w:sz="4"/>
+            </w:tcBorders>
+            <w:shd w:fill="FFFFFF" w:color="auto" w:val="clear"/>
+            <w:tcMar>
+              <w:top w:type="dxa" w:w="80"/>
+              <w:left w:type="dxa" w:w="200"/>
+              <w:bottom w:type="dxa" w:w="80"/>
+              <w:right w:type="dxa" w:w="200"/>
+            </w:tcMar>
+            <w:vAlign w:val="center"/>
+          </w:tcPr>
+          <w:p>
+            <w:pPr>
+              <w:spacing w:after="0" w:before="0"/>
+            </w:pPr>
+            <w:r>
+              <w:rPr>
+                <w:rFonts w:ascii="Arial" w:cs="Arial" w:eastAsia="Arial" w:hAnsi="Arial"/>
+                <w:b/>
+                <w:bCs/>
+                <w:color w:val="006A4E"/>
+                <w:sz w:val="15"/>
+                <w:szCs w:val="15"/>
+              </w:rPr>
+              <w:t xml:space="preserve">SPICE TO ORDER: </w:t>
+            </w:r>
+            <w:r>
+              <w:rPr>
+                <w:rFonts w:ascii="Arial" w:cs="Arial" w:eastAsia="Arial" w:hAnsi="Arial"/>
+                <w:color w:val="16211C"/>
+                <w:sz w:val="15"/>
+                <w:szCs w:val="15"/>
+              </w:rPr>
+              <w:t xml:space="preserve">curries made as hot as you like   </w:t>
+            </w:r>
+            <w:r>
+              <w:rPr>
+                <w:rFonts w:ascii="Arial" w:cs="Arial" w:eastAsia="Arial" w:hAnsi="Arial"/>
+                <w:color w:val="D0461B"/>
+                <w:sz w:val="14"/>
+                <w:szCs w:val="14"/>
+              </w:rPr>
+              <w:t xml:space="preserve"> ●</w:t>
+            </w:r>
+            <w:r>
+              <w:rPr>
+                <w:rFonts w:ascii="Arial" w:cs="Arial" w:eastAsia="Arial" w:hAnsi="Arial"/>
+                <w:b/>
+                <w:bCs/>
+                <w:color w:val="16211C"/>
+                <w:sz w:val="15"/>
+                <w:szCs w:val="15"/>
+              </w:rPr>
+              <w:t xml:space="preserve"> Slightly hot   </w:t>
+            </w:r>
+            <w:r>
+              <w:rPr>
+                <w:rFonts w:ascii="Arial" w:cs="Arial" w:eastAsia="Arial" w:hAnsi="Arial"/>
+                <w:color w:val="D0461B"/>
+                <w:sz w:val="14"/>
+                <w:szCs w:val="14"/>
+              </w:rPr>
+              <w:t xml:space="preserve"> ●●</w:t>
+            </w:r>
+            <w:r>
+              <w:rPr>
+                <w:rFonts w:ascii="Arial" w:cs="Arial" w:eastAsia="Arial" w:hAnsi="Arial"/>
+                <w:b/>
+                <w:bCs/>
+                <w:color w:val="16211C"/>
+                <w:sz w:val="15"/>
+                <w:szCs w:val="15"/>
+              </w:rPr>
+              <w:t xml:space="preserve"> Hot   </w:t>
+            </w:r>
+            <w:r>
+              <w:rPr>
+                <w:rFonts w:ascii="Arial" w:cs="Arial" w:eastAsia="Arial" w:hAnsi="Arial"/>
+                <w:color w:val="D0461B"/>
+                <w:sz w:val="14"/>
+                <w:szCs w:val="14"/>
+              </w:rPr>
+              <w:t xml:space="preserve"> ●●●</w:t>
+            </w:r>
+            <w:r>
+              <w:rPr>
+                <w:rFonts w:ascii="Arial" w:cs="Arial" w:eastAsia="Arial" w:hAnsi="Arial"/>
+                <w:b/>
+                <w:bCs/>
+                <w:color w:val="16211C"/>
+                <w:sz w:val="15"/>
+                <w:szCs w:val="15"/>
+              </w:rPr>
+              <w:t xml:space="preserve"> Madras +30p   </w:t>
+            </w:r>
+            <w:r>
+              <w:rPr>
+                <w:rFonts w:ascii="Arial" w:cs="Arial" w:eastAsia="Arial" w:hAnsi="Arial"/>
+                <w:color w:val="D0461B"/>
+                <w:sz w:val="14"/>
+                <w:szCs w:val="14"/>
+              </w:rPr>
+              <w:t xml:space="preserve"> ●●●●</w:t>
+            </w:r>
+            <w:r>
+              <w:rPr>
+                <w:rFonts w:ascii="Arial" w:cs="Arial" w:eastAsia="Arial" w:hAnsi="Arial"/>
+                <w:b/>
+                <w:bCs/>
+                <w:color w:val="16211C"/>
+                <w:sz w:val="15"/>
+                <w:szCs w:val="15"/>
+              </w:rPr>
+              <w:t xml:space="preserve"> Vindaloo +30p</w:t>
+            </w:r>
+          </w:p>
+        </w:tc>
+      </w:tr>
+    </w:tbl>
+    <w:p>
+      <w:pPr>
+        <w:spacing w:after="80" w:before="0"/>
+      </w:pPr>
+      <w:r>
+        <w:rPr>
+          <w:rFonts w:ascii="Arial" w:cs="Arial" w:eastAsia="Arial" w:hAnsi="Arial"/>
+          <w:color w:val="16211C"/>
+          <w:sz w:val="20"/>
+          <w:szCs w:val="20"/>
+        </w:rPr>
+        <w:t xml:space="preserve"/>
       </w:r>
     </w:p>
     <w:tbl>

</xml_diff>

<commit_message>
Flyer: Poppadoms spelling and complimentary line
Co-Authored-By: Claude Opus 5.5 <noreply@anthropic.com>
Claude-Session: https://claude.ai/code/session_01WQg3TD9BK9rRRVRT1LJhsu
</commit_message>
<xml_diff>
--- a/marketing/Ghar-Masala-menu-flyer-EDITABLE.docx
+++ b/marketing/Ghar-Masala-menu-flyer-EDITABLE.docx
@@ -1315,7 +1315,7 @@
                 <w:sz w:val="19"/>
                 <w:szCs w:val="19"/>
               </w:rPr>
-              <w:t xml:space="preserve">Popadums</w:t>
+              <w:t xml:space="preserve">Poppadoms</w:t>
             </w:r>
             <w:r>
               <w:rPr>
@@ -1367,7 +1367,7 @@
                 <w:sz w:val="15"/>
                 <w:szCs w:val="15"/>
               </w:rPr>
-              <w:t xml:space="preserve">✓ 1 complimentary popadum with each curry ordered</w:t>
+              <w:t xml:space="preserve">✓ Enjoy one complimentary poppadom with every curry.</w:t>
             </w:r>
           </w:p>
           <w:p>

</xml_diff>

<commit_message>
Flyer: add curry photo under Drinks on menu page
Co-Authored-By: Claude Opus 5.5 <noreply@anthropic.com>
Claude-Session: https://claude.ai/code/session_01WQg3TD9BK9rRRVRT1LJhsu
</commit_message>
<xml_diff>
--- a/marketing/Ghar-Masala-menu-flyer-EDITABLE.docx
+++ b/marketing/Ghar-Masala-menu-flyer-EDITABLE.docx
@@ -2784,6 +2784,51 @@
                 <w:szCs w:val="19"/>
               </w:rPr>
               <w:t xml:space="preserve">	£0.89</w:t>
+            </w:r>
+          </w:p>
+          <w:p>
+            <w:pPr>
+              <w:spacing w:after="0" w:before="160"/>
+            </w:pPr>
+            <w:r>
+              <w:drawing>
+                <wp:inline distT="0" distB="0" distL="0" distR="0">
+                  <wp:extent cx="3238500" cy="1390650"/>
+                  <wp:effectExtent t="0" r="0" b="0" l="0"/>
+                  <wp:docPr id="1" name="" descr="" title=""/>
+                  <wp:cNvGraphicFramePr>
+                    <a:graphicFrameLocks xmlns:a="http://schemas.openxmlformats.org/drawingml/2006/main" noChangeAspect="1"/>
+                  </wp:cNvGraphicFramePr>
+                  <a:graphic xmlns:a="http://schemas.openxmlformats.org/drawingml/2006/main">
+                    <a:graphicData uri="http://schemas.openxmlformats.org/drawingml/2006/picture">
+                      <pic:pic xmlns:pic="http://schemas.openxmlformats.org/drawingml/2006/picture">
+                        <pic:nvPicPr>
+                          <pic:cNvPr id="0" name="" descr=""/>
+                          <pic:cNvPicPr>
+                            <a:picLocks noChangeAspect="1" noChangeArrowheads="1"/>
+                          </pic:cNvPicPr>
+                        </pic:nvPicPr>
+                        <pic:blipFill>
+                          <a:blip r:embed="rId10" cstate="none"/>
+                          <a:srcRect/>
+                          <a:stretch>
+                            <a:fillRect/>
+                          </a:stretch>
+                        </pic:blipFill>
+                        <pic:spPr bwMode="auto">
+                          <a:xfrm>
+                            <a:off x="0" y="0"/>
+                            <a:ext cx="3238500" cy="1390650"/>
+                          </a:xfrm>
+                          <a:prstGeom prst="rect">
+                            <a:avLst/>
+                          </a:prstGeom>
+                        </pic:spPr>
+                      </pic:pic>
+                    </a:graphicData>
+                  </a:graphic>
+                </wp:inline>
+              </w:drawing>
             </w:r>
           </w:p>
         </w:tc>

</xml_diff>